<commit_message>
docs: atualiza caderno de guias com testes validados
</commit_message>
<xml_diff>
--- a/docs/CADERNO DE GUIAS - OAT 1 - TUTORIAIS.docx
+++ b/docs/CADERNO DE GUIAS - OAT 1 - TUTORIAIS.docx
@@ -4041,67 +4041,6 @@
     </w:p>
     <w:p>
       <w:pPr>
-        <w:spacing w:after="200" w:line="360" w:lineRule="auto"/>
-        <w:ind w:left="0" w:firstLine="0"/>
-        <w:jc w:val="both"/>
-        <w:rPr>
-          <w:sz w:val="24"/>
-          <w:szCs w:val="24"/>
-        </w:rPr>
-      </w:pPr>
-      <w:r>
-        <w:rPr>
-          <w:rtl w:val="0"/>
-        </w:rPr>
-      </w:r>
-    </w:p>
-    <w:p>
-      <w:pPr>
-        <w:spacing w:after="200" w:line="360" w:lineRule="auto"/>
-        <w:rPr>
-          <w:rFonts w:ascii="Roboto Mono" w:cs="Roboto Mono" w:eastAsia="Roboto Mono" w:hAnsi="Roboto Mono"/>
-          <w:sz w:val="24"/>
-          <w:szCs w:val="24"/>
-        </w:rPr>
-      </w:pPr>
-      <w:r>
-        <w:rPr>
-          <w:rtl w:val="0"/>
-        </w:rPr>
-      </w:r>
-    </w:p>
-    <w:p>
-      <w:pPr>
-        <w:spacing w:after="200" w:line="360" w:lineRule="auto"/>
-        <w:jc w:val="both"/>
-        <w:rPr>
-          <w:sz w:val="24"/>
-          <w:szCs w:val="24"/>
-        </w:rPr>
-      </w:pPr>
-      <w:r>
-        <w:rPr>
-          <w:rtl w:val="0"/>
-        </w:rPr>
-      </w:r>
-    </w:p>
-    <w:p>
-      <w:pPr>
-        <w:spacing w:after="200" w:line="360" w:lineRule="auto"/>
-        <w:jc w:val="both"/>
-        <w:rPr>
-          <w:sz w:val="24"/>
-          <w:szCs w:val="24"/>
-        </w:rPr>
-      </w:pPr>
-      <w:r>
-        <w:rPr>
-          <w:rtl w:val="0"/>
-        </w:rPr>
-      </w:r>
-    </w:p>
-    <w:p>
-      <w:pPr>
         <w:spacing w:after="200" w:before="240" w:line="360" w:lineRule="auto"/>
         <w:jc w:val="both"/>
         <w:rPr>
@@ -5228,22 +5167,55 @@
         </w:rPr>
         <w:t xml:space="preserve">?</w:t>
       </w:r>
+      <w:r>
+        <w:rPr>
+          <w:rtl w:val="0"/>
+        </w:rPr>
+      </w:r>
     </w:p>
     <w:p>
       <w:pPr>
         <w:spacing w:after="200" w:line="360" w:lineRule="auto"/>
         <w:ind w:left="1440" w:firstLine="0"/>
         <w:rPr>
-          <w:b w:val="1"/>
-          <w:bCs w:val="1"/>
-          <w:sz w:val="24"/>
-          <w:szCs w:val="24"/>
-        </w:rPr>
-      </w:pPr>
-      <w:r>
-        <w:rPr>
-          <w:rtl w:val="0"/>
-        </w:rPr>
+          <w:sz w:val="24"/>
+          <w:szCs w:val="24"/>
+        </w:rPr>
+      </w:pPr>
+      <w:r>
+        <w:rPr>
+          <w:b w:val="1"/>
+          <w:bCs w:val="1"/>
+          <w:sz w:val="24"/>
+          <w:szCs w:val="24"/>
+          <w:rtl w:val="0"/>
+        </w:rPr>
+        <w:t xml:space="preserve">Resposta: </w:t>
+      </w:r>
+      <w:r>
+        <w:rPr>
+          <w:sz w:val="24"/>
+          <w:szCs w:val="24"/>
+          <w:rtl w:val="0"/>
+        </w:rPr>
+        <w:t xml:space="preserve">No Diagrama de Classes, representamos o Controller como uma classe que possui uma associação de uso (dependência) com o Singleton Repository. A relação indica que o Controller invoca o método estático </w:t>
+      </w:r>
+      <w:r>
+        <w:rPr>
+          <w:rFonts w:ascii="Roboto Mono" w:cs="Roboto Mono" w:eastAsia="Roboto Mono" w:hAnsi="Roboto Mono"/>
+          <w:sz w:val="24"/>
+          <w:szCs w:val="24"/>
+          <w:rtl w:val="0"/>
+        </w:rPr>
+        <w:t xml:space="preserve">getInstance()</w:t>
+      </w:r>
+      <w:r>
+        <w:rPr>
+          <w:sz w:val="24"/>
+          <w:szCs w:val="24"/>
+          <w:rtl w:val="0"/>
+        </w:rPr>
+        <w:t xml:space="preserve"> do Repository, demonstrando o fluxo de controle da camada web para a camada de persistência.</w:t>
       </w:r>
     </w:p>
     <w:p>
@@ -5251,8 +5223,6 @@
         <w:spacing w:after="200" w:line="360" w:lineRule="auto"/>
         <w:ind w:left="1440" w:firstLine="0"/>
         <w:rPr>
-          <w:b w:val="1"/>
-          <w:bCs w:val="1"/>
           <w:sz w:val="24"/>
           <w:szCs w:val="24"/>
         </w:rPr>
@@ -5274,38 +5244,8 @@
       </w:pPr>
       <w:r>
         <w:rPr>
-          <w:b w:val="1"/>
-          <w:bCs w:val="1"/>
-          <w:sz w:val="24"/>
-          <w:szCs w:val="24"/>
-          <w:rtl w:val="0"/>
-        </w:rPr>
-        <w:t xml:space="preserve">Resposta: </w:t>
-      </w:r>
-      <w:r>
-        <w:rPr>
-          <w:sz w:val="24"/>
-          <w:szCs w:val="24"/>
-          <w:rtl w:val="0"/>
-        </w:rPr>
-        <w:t xml:space="preserve">No Diagrama de Classes, representamos o Controller como uma classe que possui uma associação de uso (dependência) com o Singleton Repository. A relação indica que o Controller invoca o método estático </w:t>
-      </w:r>
-      <w:r>
-        <w:rPr>
-          <w:rFonts w:ascii="Roboto Mono" w:cs="Roboto Mono" w:eastAsia="Roboto Mono" w:hAnsi="Roboto Mono"/>
-          <w:sz w:val="24"/>
-          <w:szCs w:val="24"/>
-          <w:rtl w:val="0"/>
-        </w:rPr>
-        <w:t xml:space="preserve">getInstance()</w:t>
-      </w:r>
-      <w:r>
-        <w:rPr>
-          <w:sz w:val="24"/>
-          <w:szCs w:val="24"/>
-          <w:rtl w:val="0"/>
-        </w:rPr>
-        <w:t xml:space="preserve"> do Repository, demonstrando o fluxo de controle da camada web para a camada de persistência.</w:t>
+          <w:rtl w:val="0"/>
+        </w:rPr>
       </w:r>
     </w:p>
     <w:p>
@@ -5326,23 +5266,16 @@
     <w:p>
       <w:pPr>
         <w:spacing w:after="200" w:line="360" w:lineRule="auto"/>
-        <w:jc w:val="both"/>
-        <w:rPr>
-          <w:b w:val="1"/>
-          <w:bCs w:val="1"/>
-          <w:sz w:val="24"/>
-          <w:szCs w:val="24"/>
-        </w:rPr>
-      </w:pPr>
-      <w:r>
-        <w:rPr>
-          <w:b w:val="1"/>
-          <w:bCs w:val="1"/>
-          <w:sz w:val="24"/>
-          <w:szCs w:val="24"/>
-          <w:rtl w:val="0"/>
-        </w:rPr>
-        <w:t xml:space="preserve">Cenários de Teste:</w:t>
+        <w:ind w:left="1440" w:firstLine="0"/>
+        <w:rPr>
+          <w:sz w:val="24"/>
+          <w:szCs w:val="24"/>
+        </w:rPr>
+      </w:pPr>
+      <w:r>
+        <w:rPr>
+          <w:rtl w:val="0"/>
+        </w:rPr>
       </w:r>
     </w:p>
     <w:p>
@@ -5350,6 +5283,28 @@
         <w:spacing w:after="200" w:line="360" w:lineRule="auto"/>
         <w:jc w:val="both"/>
         <w:rPr>
+          <w:b w:val="1"/>
+          <w:bCs w:val="1"/>
+          <w:sz w:val="24"/>
+          <w:szCs w:val="24"/>
+        </w:rPr>
+      </w:pPr>
+      <w:r>
+        <w:rPr>
+          <w:b w:val="1"/>
+          <w:bCs w:val="1"/>
+          <w:sz w:val="24"/>
+          <w:szCs w:val="24"/>
+          <w:rtl w:val="0"/>
+        </w:rPr>
+        <w:t xml:space="preserve">Cenários de Teste:</w:t>
+      </w:r>
+    </w:p>
+    <w:p>
+      <w:pPr>
+        <w:spacing w:after="200" w:line="360" w:lineRule="auto"/>
+        <w:jc w:val="both"/>
+        <w:rPr>
           <w:i w:val="1"/>
           <w:iCs w:val="1"/>
           <w:sz w:val="24"/>
@@ -5420,7 +5375,7 @@
           <w:szCs w:val="24"/>
           <w:rtl w:val="0"/>
         </w:rPr>
-        <w:t xml:space="preserve">Augusto Brandão</w:t>
+        <w:t xml:space="preserve">Hellen Verena</w:t>
       </w:r>
     </w:p>
     <w:p>
@@ -5719,7 +5674,7 @@
           <w:szCs w:val="24"/>
           <w:rtl w:val="0"/>
         </w:rPr>
-        <w:t xml:space="preserve">⏳ A Executar na Sessão Síncrona / Postman</w:t>
+        <w:t xml:space="preserve">✅ Passou / Aprovado no Postman Runner </w:t>
       </w:r>
       <w:r>
         <w:rPr>
@@ -5743,19 +5698,25 @@
           <w:szCs w:val="24"/>
           <w:rtl w:val="0"/>
         </w:rPr>
-        <w:t xml:space="preserve">Observações do Piloto/Dev: </w:t>
-      </w:r>
-      <w:r>
-        <w:rPr>
-          <w:sz w:val="24"/>
-          <w:szCs w:val="24"/>
-          <w:rtl w:val="0"/>
-        </w:rPr>
-        <w:t xml:space="preserve">Testes mapeados para execução via Collection oficial do Postman (</w:t>
+        <w:t xml:space="preserve">Observações do Piloto/Dev: Executado e validado com sucesso via Collection oficial </w:t>
+      </w:r>
+      <w:r>
+        <w:rPr>
+          <w:b w:val="1"/>
+          <w:bCs w:val="1"/>
+          <w:color w:val="434343"/>
+          <w:sz w:val="24"/>
+          <w:szCs w:val="24"/>
+          <w:rtl w:val="0"/>
+        </w:rPr>
+        <w:t xml:space="preserve">(</w:t>
       </w:r>
       <w:r>
         <w:rPr>
           <w:rFonts w:ascii="Roboto Mono" w:cs="Roboto Mono" w:eastAsia="Roboto Mono" w:hAnsi="Roboto Mono"/>
+          <w:b w:val="1"/>
+          <w:bCs w:val="1"/>
+          <w:color w:val="434343"/>
           <w:sz w:val="24"/>
           <w:szCs w:val="24"/>
           <w:rtl w:val="0"/>
@@ -5764,105 +5725,25 @@
       </w:r>
       <w:r>
         <w:rPr>
-          <w:sz w:val="24"/>
-          <w:szCs w:val="24"/>
-          <w:rtl w:val="0"/>
-        </w:rPr>
-        <w:t xml:space="preserve">).</w:t>
-      </w:r>
-    </w:p>
-    <w:p>
-      <w:pPr>
-        <w:spacing w:line="360" w:lineRule="auto"/>
-        <w:rPr>
-          <w:sz w:val="24"/>
-          <w:szCs w:val="24"/>
-        </w:rPr>
-      </w:pPr>
-      <w:r>
-        <w:rPr>
-          <w:rtl w:val="0"/>
-        </w:rPr>
-      </w:r>
-    </w:p>
-    <w:p>
-      <w:pPr>
-        <w:spacing w:line="360" w:lineRule="auto"/>
-        <w:rPr>
-          <w:sz w:val="24"/>
-          <w:szCs w:val="24"/>
-        </w:rPr>
-      </w:pPr>
-      <w:r>
-        <w:rPr>
-          <w:rtl w:val="0"/>
-        </w:rPr>
-      </w:r>
-    </w:p>
-    <w:p>
-      <w:pPr>
-        <w:spacing w:line="360" w:lineRule="auto"/>
-        <w:rPr>
-          <w:sz w:val="24"/>
-          <w:szCs w:val="24"/>
-        </w:rPr>
-      </w:pPr>
-      <w:r>
-        <w:rPr>
-          <w:rtl w:val="0"/>
-        </w:rPr>
-      </w:r>
-    </w:p>
-    <w:p>
-      <w:pPr>
-        <w:spacing w:line="360" w:lineRule="auto"/>
-        <w:rPr>
-          <w:sz w:val="24"/>
-          <w:szCs w:val="24"/>
-        </w:rPr>
-      </w:pPr>
-      <w:r>
-        <w:rPr>
-          <w:rtl w:val="0"/>
-        </w:rPr>
-      </w:r>
-    </w:p>
-    <w:p>
-      <w:pPr>
-        <w:spacing w:line="360" w:lineRule="auto"/>
-        <w:rPr>
-          <w:sz w:val="24"/>
-          <w:szCs w:val="24"/>
-        </w:rPr>
-      </w:pPr>
-      <w:r>
-        <w:rPr>
-          <w:rtl w:val="0"/>
-        </w:rPr>
-      </w:r>
-    </w:p>
-    <w:p>
-      <w:pPr>
-        <w:spacing w:line="360" w:lineRule="auto"/>
-        <w:rPr>
-          <w:sz w:val="24"/>
-          <w:szCs w:val="24"/>
-        </w:rPr>
-      </w:pPr>
-      <w:r>
-        <w:rPr>
-          <w:rtl w:val="0"/>
-        </w:rPr>
-      </w:r>
-    </w:p>
-    <w:p>
-      <w:pPr>
-        <w:spacing w:line="360" w:lineRule="auto"/>
-        <w:rPr>
-          <w:sz w:val="24"/>
-          <w:szCs w:val="24"/>
-        </w:rPr>
-      </w:pPr>
+          <w:b w:val="1"/>
+          <w:bCs w:val="1"/>
+          <w:color w:val="434343"/>
+          <w:sz w:val="24"/>
+          <w:szCs w:val="24"/>
+          <w:rtl w:val="0"/>
+        </w:rPr>
+        <w:t xml:space="preserve">)</w:t>
+      </w:r>
+      <w:r>
+        <w:rPr>
+          <w:b w:val="1"/>
+          <w:bCs w:val="1"/>
+          <w:sz w:val="24"/>
+          <w:szCs w:val="24"/>
+          <w:rtl w:val="0"/>
+        </w:rPr>
+        <w:t xml:space="preserve"> com retorno 201 Created.</w:t>
+      </w:r>
       <w:r>
         <w:rPr>
           <w:rtl w:val="0"/>
@@ -5929,7 +5810,7 @@
           <w:szCs w:val="24"/>
           <w:rtl w:val="0"/>
         </w:rPr>
-        <w:t xml:space="preserve">Augusto Brandão</w:t>
+        <w:t xml:space="preserve">Hellen Verena</w:t>
       </w:r>
     </w:p>
     <w:p>
@@ -6167,6 +6048,36 @@
     <w:p>
       <w:pPr>
         <w:spacing w:line="360" w:lineRule="auto"/>
+        <w:ind w:left="1440" w:firstLine="0"/>
+        <w:rPr>
+          <w:sz w:val="24"/>
+          <w:szCs w:val="24"/>
+        </w:rPr>
+      </w:pPr>
+      <w:r>
+        <w:rPr>
+          <w:rtl w:val="0"/>
+        </w:rPr>
+      </w:r>
+    </w:p>
+    <w:p>
+      <w:pPr>
+        <w:spacing w:line="360" w:lineRule="auto"/>
+        <w:ind w:left="1440" w:firstLine="0"/>
+        <w:rPr>
+          <w:sz w:val="24"/>
+          <w:szCs w:val="24"/>
+        </w:rPr>
+      </w:pPr>
+      <w:r>
+        <w:rPr>
+          <w:rtl w:val="0"/>
+        </w:rPr>
+      </w:r>
+    </w:p>
+    <w:p>
+      <w:pPr>
+        <w:spacing w:line="360" w:lineRule="auto"/>
         <w:rPr/>
       </w:pPr>
       <w:r>
@@ -6186,7 +6097,7 @@
           <w:szCs w:val="24"/>
           <w:rtl w:val="0"/>
         </w:rPr>
-        <w:t xml:space="preserve">⏳ A Executar na Sessão Síncrona / Postman</w:t>
+        <w:t xml:space="preserve">✅ Passou / Aprovado no Postman Runner</w:t>
       </w:r>
       <w:r>
         <w:rPr>
@@ -6218,7 +6129,47 @@
           <w:szCs w:val="24"/>
           <w:rtl w:val="0"/>
         </w:rPr>
-        <w:t xml:space="preserve">Tratamento com Optional e ResponseEntity validado com sucesso.</w:t>
+        <w:t xml:space="preserve">Tratamento com </w:t>
+      </w:r>
+      <w:r>
+        <w:rPr>
+          <w:rFonts w:ascii="Roboto Mono" w:cs="Roboto Mono" w:eastAsia="Roboto Mono" w:hAnsi="Roboto Mono"/>
+          <w:b w:val="1"/>
+          <w:bCs w:val="1"/>
+          <w:color w:val="666666"/>
+          <w:sz w:val="24"/>
+          <w:szCs w:val="24"/>
+          <w:rtl w:val="0"/>
+        </w:rPr>
+        <w:t xml:space="preserve">Optional</w:t>
+      </w:r>
+      <w:r>
+        <w:rPr>
+          <w:sz w:val="24"/>
+          <w:szCs w:val="24"/>
+          <w:rtl w:val="0"/>
+        </w:rPr>
+        <w:t xml:space="preserve"> e </w:t>
+      </w:r>
+      <w:r>
+        <w:rPr>
+          <w:rFonts w:ascii="Roboto Mono" w:cs="Roboto Mono" w:eastAsia="Roboto Mono" w:hAnsi="Roboto Mono"/>
+          <w:b w:val="1"/>
+          <w:bCs w:val="1"/>
+          <w:color w:val="434343"/>
+          <w:sz w:val="24"/>
+          <w:szCs w:val="24"/>
+          <w:rtl w:val="0"/>
+        </w:rPr>
+        <w:t xml:space="preserve">ResponseEntity.notFound().build()</w:t>
+      </w:r>
+      <w:r>
+        <w:rPr>
+          <w:sz w:val="24"/>
+          <w:szCs w:val="24"/>
+          <w:rtl w:val="0"/>
+        </w:rPr>
+        <w:t xml:space="preserve"> validado com sucesso no Postman Runner. </w:t>
       </w:r>
     </w:p>
     <w:p>

</xml_diff>